<commit_message>
Compact paper tests with readable 11-point type and print-ready PDF pack
</commit_message>
<xml_diff>
--- a/docs/Moon-Campus-Development-Brief.docx
+++ b/docs/Moon-Campus-Development-Brief.docx
@@ -1259,6 +1259,19 @@
         <w:t>Не включать в новые документы реальные ФИО и фактические оценки. Этот бриф — контракт разработки, а не исследовательское заключение или обещание реализации всех задач из списка.</w:t>
       </w:r>
     </w:p>
+    <w:p>
+      <w:pPr>
+        <w:pStyle w:val="Heading2"/>
+      </w:pPr>
+      <w:r>
+        <w:t>Актуализация печати — 12 октября 2026</w:t>
+      </w:r>
+    </w:p>
+    <w:p>
+      <w:r>
+        <w:t>Компактные задания: группы 214/216/217 — 3 страницы A4; 213/215 — 4, включая отдельную страницу preview (ранее 5 и 7 соответственно). Arial 11 pt, одинарный интервал, поля 11,5 мм сверху/снизу и 12,5 мм по бокам. Формулировки, варианты, согласие и темы эссе сохранены; каждый вопрос остаётся вместе с A–E. Основные два архива остаются редактируемыми DOCX-комплектами по 11 файлов. Для готовой печати отдельный Revision-Unit-7-Compact-PDF-Pack.zip, также 11 файлов, с PDF вместо DOCX заданий. PDF фиксирует пагинацию; DOCX может немного отличаться между версиями Word/LibreOffice. Не добавлять дубли обоих форматов в один комплект. Официальный ZipGrade и двусторонние эссе не уменьшать. Форматирование повторяется через scripts/compact_revision_papers.py; после изменения содержания обязательно заново проверить рендер и ключи.</w:t>
+      </w:r>
+    </w:p>
     <w:sectPr>
       <w:pgSz w:w="12240" w:h="15840"/>
       <w:pgMar w:top="1440" w:right="1800" w:bottom="1440" w:left="1800" w:header="720" w:footer="720" w:gutter="0"/>

</xml_diff>

<commit_message>
Audit platform, repair browser deletion and preserve grading across material versions
</commit_message>
<xml_diff>
--- a/docs/Moon-Campus-Development-Brief.docx
+++ b/docs/Moon-Campus-Development-Brief.docx
@@ -1272,6 +1272,19 @@
         <w:t>Компактные задания: группы 214/216/217 — 3 страницы A4; 213/215 — 4, включая отдельную страницу preview (ранее 5 и 7 соответственно). Arial 11 pt, одинарный интервал, поля 11,5 мм сверху/снизу и 12,5 мм по бокам. Формулировки, варианты, согласие и темы эссе сохранены; каждый вопрос остаётся вместе с A–E. Основные два архива остаются редактируемыми DOCX-комплектами по 11 файлов. Для готовой печати отдельный Revision-Unit-7-Compact-PDF-Pack.zip, также 11 файлов, с PDF вместо DOCX заданий. PDF фиксирует пагинацию; DOCX может немного отличаться между версиями Word/LibreOffice. Не добавлять дубли обоих форматов в один комплект. Официальный ZipGrade и двусторонние эссе не уменьшать. Форматирование повторяется через scripts/compact_revision_papers.py; после изменения содержания обязательно заново проверить рендер и ключи.</w:t>
       </w:r>
     </w:p>
+    <w:p>
+      <w:pPr>
+        <w:pStyle w:val="Heading2"/>
+      </w:pPr>
+      <w:r>
+        <w:t>Проверка платформы и дальнейший UX</w:t>
+      </w:r>
+    </w:p>
+    <w:p>
+      <w:r>
+        <w:t>Подробности аудита: docs/platform-audit-2026-10-12.md. Исправлены CORS DELETE, защита ключей разных версий при regrade и 19 заданий на контекст/явные субъекты. Начатые попытки и ручные правки сохраняются. Следующий UX-приоритет: очередь устной части и постоянная панель пары; затем компактный итог с причиной pending и переход от слабых заданий к ответам. Эти UX-функции пока являются планом.</w:t>
+      </w:r>
+    </w:p>
     <w:sectPr>
       <w:pgSz w:w="12240" w:h="15840"/>
       <w:pgMar w:top="1440" w:right="1800" w:bottom="1440" w:left="1800" w:header="720" w:footer="720" w:gutter="0"/>

</xml_diff>

<commit_message>
Show teacher dialogue tasks and add save-refresh feedback and completion thanks
</commit_message>
<xml_diff>
--- a/docs/Moon-Campus-Development-Brief.docx
+++ b/docs/Moon-Campus-Development-Brief.docx
@@ -1285,6 +1285,19 @@
         <w:t>Подробности аудита: docs/platform-audit-2026-10-12.md. Исправлены CORS DELETE, защита ключей разных версий при regrade и 19 заданий на контекст/явные субъекты. Начатые попытки и ручные правки сохраняются. Следующий UX-приоритет: очередь устной части и постоянная панель пары; затем компактный итог с причиной pending и переход от слабых заданий к ответам. Эти UX-функции пока являются планом.</w:t>
       </w:r>
     </w:p>
+    <w:p>
+      <w:pPr>
+        <w:pStyle w:val="Heading2"/>
+      </w:pPr>
+      <w:r>
+        <w:t>Обратная связь действий и диалог с преподавателем</w:t>
+      </w:r>
+    </w:p>
+    <w:p>
+      <w:r>
+        <w:t>Для student–teacher показываются ситуация и роли, преподаватель — B. Студенческий экран благодарит за участие. Общий action-feedback.js отображает загрузку, успех или ошибку сохранения/обновления в подключённом кабинете и revision tests; повторные отправки блокируются. Очередь устной части остаётся планом.</w:t>
+      </w:r>
+    </w:p>
     <w:sectPr>
       <w:pgSz w:w="12240" w:h="15840"/>
       <w:pgMar w:top="1440" w:right="1800" w:bottom="1440" w:left="1800" w:header="720" w:footer="720" w:gutter="0"/>

</xml_diff>

<commit_message>
Encourage studied language and provide supportive evidence-based AI essay feedback
</commit_message>
<xml_diff>
--- a/docs/Moon-Campus-Development-Brief.docx
+++ b/docs/Moon-Campus-Development-Brief.docx
@@ -1298,6 +1298,19 @@
         <w:t>Для student–teacher показываются ситуация и роли, преподаватель — B. Студенческий экран благодарит за участие. Общий action-feedback.js отображает загрузку, успех или ошибку сохранения/обновления в подключённом кабинете и revision tests; повторные отправки блокируются. Очередь устной части остаётся планом.</w:t>
       </w:r>
     </w:p>
+    <w:p>
+      <w:pPr>
+        <w:pStyle w:val="Heading2"/>
+      </w:pPr>
+      <w:r>
+        <w:t>Учебный язык и поддерживающий AI feedback</w:t>
+      </w:r>
+    </w:p>
+    <w:p>
+      <w:r>
+        <w:t>Инструкции сайта и бумаги требуют естественно использовать пройденные лексику и грамматику. AI даёт умеренно щадящую учебную оценку без фиксированной прибавки и двойных штрафов; отзыв доброжелательный. До трёх примеров (ошибка → исправление — объяснение) проверяются по реальным цитатам. Старые AI-предложения требуют повторной проверки; оценки преподавателя не меняются автоматически.</w:t>
+      </w:r>
+    </w:p>
     <w:sectPr>
       <w:pgSz w:w="12240" w:h="15840"/>
       <w:pgMar w:top="1440" w:right="1800" w:bottom="1440" w:left="1800" w:header="720" w:footer="720" w:gutter="0"/>

</xml_diff>

<commit_message>
Preserve latest essay draft and topic across repeated reloads
</commit_message>
<xml_diff>
--- a/docs/Moon-Campus-Development-Brief.docx
+++ b/docs/Moon-Campus-Development-Brief.docx
@@ -1311,6 +1311,19 @@
         <w:t>Инструкции сайта и бумаги требуют естественно использовать пройденные лексику и грамматику. AI даёт умеренно щадящую учебную оценку без фиксированной прибавки и двойных штрафов; отзыв доброжелательный. До трёх примеров (ошибка → исправление — объяснение) проверяются по реальным цитатам. Старые AI-предложения требуют повторной проверки; оценки преподавателя не меняются автоматически.</w:t>
       </w:r>
     </w:p>
+    <w:p>
+      <w:pPr>
+        <w:pStyle w:val="Heading2"/>
+      </w:pPr>
+      <w:r>
+        <w:t>Сохранность эссе при перезагрузке</w:t>
+      </w:r>
+    </w:p>
+    <w:p>
+      <w:r>
+        <w:t>Draft восстанавливается до экрана Continue. Сохраняются текст с абзацами и выбранная тема, даже если на сервере старая версия и PUT недоступен. Проверено три reload подряд до продолжения. pagehide читает текущие поля. Сохранение локальное в том же браузере; загрузка страницы без связи и перенос несохранённого текста между устройствами не гарантируются.</w:t>
+      </w:r>
+    </w:p>
     <w:sectPr>
       <w:pgSz w:w="12240" w:h="15840"/>
       <w:pgMar w:top="1440" w:right="1800" w:bottom="1440" w:left="1800" w:header="720" w:footer="720" w:gutter="0"/>

</xml_diff>